<commit_message>
Content updates from client feedback
- Footer on every page: המרכז לניהול קריירה
- Links for exchange, mentoring ('מספסל הלימודים לניהול'), diversity program
- Direction question: 'להתקדם לניהול' and 'להתקדם לתפקיד ייעוץ'
- Skills wording: management instead of presenting, plus 'וכדומה'

Co-Authored-By: Claude Opus 5.5 <noreply@anthropic.com>
</commit_message>
<xml_diff>
--- a/docs/רשימת פעילויות לעיון.docx
+++ b/docs/רשימת פעילויות לעיון.docx
@@ -232,7 +232,7 @@
           <w:szCs w:val="22"/>
           <w:rtl/>
         </w:rPr>
-        <w:t xml:space="preserve">לחזק מיומנויות שעולם העבודה מחפש: הצגה, מו"מ, הובלה ועבודת צוות</w:t>
+        <w:t xml:space="preserve">לחזק מיומנויות שעולם העבודה מחפש: ניהול, מו"מ, הובלה, עבודת צוות וכדומה</w:t>
       </w:r>
     </w:p>
     <w:p>
@@ -921,7 +921,7 @@
               <w:spacing w:after="40"/>
               <w:jc w:val="right"/>
             </w:pPr>
-            <w:hyperlink w:history="1" r:id="rIdryei7_vozf4yo05svavfh">
+            <w:hyperlink w:history="1" r:id="rIdeklqtxxc9vydqt50ydgkz">
               <w:r>
                 <w:rPr>
                   <w:rStyle w:val="Hyperlink"/>
@@ -2171,7 +2171,7 @@
               <w:spacing w:after="40"/>
               <w:jc w:val="right"/>
             </w:pPr>
-            <w:hyperlink w:history="1" r:id="rIdneajxttx9ambfbsom0jpm">
+            <w:hyperlink w:history="1" r:id="rIdheeitts0ylhvul_feszr0">
               <w:r>
                 <w:rPr>
                   <w:rStyle w:val="Hyperlink"/>
@@ -2327,6 +2327,25 @@
               <w:t xml:space="preserve">להציג את עצמך למרצה האורח, לכתוב תודה אחרי ההרצאה ולהתחבר בלינקדאין</w:t>
             </w:r>
           </w:p>
+          <w:p>
+            <w:pPr>
+              <w:bidi/>
+              <w:spacing w:after="40"/>
+              <w:jc w:val="right"/>
+            </w:pPr>
+            <w:r>
+              <w:rPr>
+                <w:rFonts w:ascii="Arial" w:cs="Arial" w:eastAsia="Arial" w:hAnsi="Arial"/>
+                <w:i/>
+                <w:iCs/>
+                <w:color w:val="555555"/>
+                <w:sz w:val="19"/>
+                <w:szCs w:val="19"/>
+                <w:rtl/>
+              </w:rPr>
+              <w:t xml:space="preserve">מופיעה גבוה יותר עבור: מי שרוצה להתקדם לייעוץ</w:t>
+            </w:r>
+          </w:p>
         </w:tc>
         <w:tc>
           <w:tcPr>
@@ -2824,7 +2843,7 @@
               <w:spacing w:after="40"/>
               <w:jc w:val="right"/>
             </w:pPr>
-            <w:hyperlink w:history="1" r:id="rIdcblftu9bb3zvox4xjlx1m">
+            <w:hyperlink w:history="1" r:id="rIdyptxnwzlptu15lfv6pl7g">
               <w:r>
                 <w:rPr>
                   <w:rStyle w:val="Hyperlink"/>
@@ -2980,6 +2999,25 @@
               <w:t xml:space="preserve">להוביל צוות, לארגן אירועים ולהכיר את התעשייה מבפנים</w:t>
             </w:r>
           </w:p>
+          <w:p>
+            <w:pPr>
+              <w:bidi/>
+              <w:spacing w:after="40"/>
+              <w:jc w:val="right"/>
+            </w:pPr>
+            <w:r>
+              <w:rPr>
+                <w:rFonts w:ascii="Arial" w:cs="Arial" w:eastAsia="Arial" w:hAnsi="Arial"/>
+                <w:i/>
+                <w:iCs/>
+                <w:color w:val="555555"/>
+                <w:sz w:val="19"/>
+                <w:szCs w:val="19"/>
+                <w:rtl/>
+              </w:rPr>
+              <w:t xml:space="preserve">מופיעה גבוה יותר עבור: מי שרוצה להתקדם לניהול</w:t>
+            </w:r>
+          </w:p>
         </w:tc>
         <w:tc>
           <w:tcPr>
@@ -3142,7 +3180,7 @@
               <w:spacing w:after="40"/>
               <w:jc w:val="right"/>
             </w:pPr>
-            <w:hyperlink w:history="1" r:id="rIdii1hn7wndhiipl_iy62yr">
+            <w:hyperlink w:history="1" r:id="rId2dfonr_536duicgwrg7zz">
               <w:r>
                 <w:rPr>
                   <w:rStyle w:val="Hyperlink"/>
@@ -3261,7 +3299,7 @@
                 <w:szCs w:val="19"/>
                 <w:rtl/>
               </w:rPr>
-              <w:t xml:space="preserve">תוכנית מנטורינג MBA</w:t>
+              <w:t xml:space="preserve">תוכנית המנטורינג "מספסל הלימודים לניהול"</w:t>
             </w:r>
           </w:p>
         </w:tc>
@@ -3476,7 +3514,7 @@
               <w:spacing w:after="40"/>
               <w:jc w:val="right"/>
             </w:pPr>
-            <w:hyperlink w:history="1" r:id="rIdnebm6r24tqpr3a9d6gsjq">
+            <w:hyperlink w:history="1" r:id="rIdqxmawjurebbfn6rhsb-nn">
               <w:r>
                 <w:rPr>
                   <w:rStyle w:val="Hyperlink"/>
@@ -4096,7 +4134,7 @@
               <w:spacing w:after="40"/>
               <w:jc w:val="right"/>
             </w:pPr>
-            <w:hyperlink w:history="1" r:id="rIdxs7uakshgqbxhyyvw2go8">
+            <w:hyperlink w:history="1" r:id="rIdxnicinhvkcdwxn5n65qxb">
               <w:r>
                 <w:rPr>
                   <w:rStyle w:val="Hyperlink"/>
@@ -5200,7 +5238,7 @@
                 <w:szCs w:val="19"/>
                 <w:rtl/>
               </w:rPr>
-              <w:t xml:space="preserve">מופיעה גבוה יותר עבור: מי שרוצה לעבור תחום</w:t>
+              <w:t xml:space="preserve">מופיעה גבוה יותר עבור: מי שרוצה להתקדם לייעוץ, מי שרוצה לעבור תחום</w:t>
             </w:r>
           </w:p>
         </w:tc>
@@ -5665,7 +5703,7 @@
               <w:spacing w:after="40"/>
               <w:jc w:val="right"/>
             </w:pPr>
-            <w:hyperlink w:history="1" r:id="rIdm0oqjbbkjx5qlqigvlvui">
+            <w:hyperlink w:history="1" r:id="rIdrbkjp0ti22jsf9xskjlx4">
               <w:r>
                 <w:rPr>
                   <w:rStyle w:val="Hyperlink"/>
@@ -6015,7 +6053,7 @@
               <w:spacing w:after="40"/>
               <w:jc w:val="right"/>
             </w:pPr>
-            <w:hyperlink w:history="1" r:id="rIdbfwppaqszlxd_c1eiu253">
+            <w:hyperlink w:history="1" r:id="rIdk1dosa9avyexi7dgux6_v">
               <w:r>
                 <w:rPr>
                   <w:rStyle w:val="Hyperlink"/>
@@ -6171,308 +6209,6 @@
               <w:t xml:space="preserve">פיתוח מיומנויות להובלת צוותים מגוונים</w:t>
             </w:r>
           </w:p>
-        </w:tc>
-        <w:tc>
-          <w:tcPr>
-            <w:tcW w:type="dxa" w:w="1650"/>
-            <w:tcBorders>
-              <w:top w:val="single" w:color="B8BFCC" w:sz="4"/>
-              <w:left w:val="single" w:color="B8BFCC" w:sz="4"/>
-              <w:bottom w:val="single" w:color="B8BFCC" w:sz="4"/>
-              <w:right w:val="single" w:color="B8BFCC" w:sz="4"/>
-            </w:tcBorders>
-            <w:tcMar>
-              <w:top w:type="dxa" w:w="80"/>
-              <w:left w:type="dxa" w:w="100"/>
-              <w:bottom w:type="dxa" w:w="80"/>
-              <w:right w:type="dxa" w:w="100"/>
-            </w:tcMar>
-            <w:vAlign w:val="top"/>
-          </w:tcPr>
-          <w:p>
-            <w:pPr>
-              <w:bidi/>
-              <w:spacing w:after="20"/>
-              <w:jc w:val="right"/>
-            </w:pPr>
-            <w:r>
-              <w:rPr>
-                <w:rFonts w:ascii="Arial" w:cs="Arial" w:eastAsia="Arial" w:hAnsi="Arial"/>
-                <w:sz w:val="19"/>
-                <w:szCs w:val="19"/>
-                <w:rtl/>
-              </w:rPr>
-              <w:t xml:space="preserve">פיתוח מיומנויות</w:t>
-            </w:r>
-          </w:p>
-        </w:tc>
-        <w:tc>
-          <w:tcPr>
-            <w:tcW w:type="dxa" w:w="1150"/>
-            <w:tcBorders>
-              <w:top w:val="single" w:color="B8BFCC" w:sz="4"/>
-              <w:left w:val="single" w:color="B8BFCC" w:sz="4"/>
-              <w:bottom w:val="single" w:color="B8BFCC" w:sz="4"/>
-              <w:right w:val="single" w:color="B8BFCC" w:sz="4"/>
-            </w:tcBorders>
-            <w:shd w:fill="FFF4DC" w:color="auto" w:val="clear"/>
-            <w:tcMar>
-              <w:top w:type="dxa" w:w="80"/>
-              <w:left w:type="dxa" w:w="100"/>
-              <w:bottom w:type="dxa" w:w="80"/>
-              <w:right w:type="dxa" w:w="100"/>
-            </w:tcMar>
-            <w:vAlign w:val="top"/>
-          </w:tcPr>
-          <w:p>
-            <w:pPr>
-              <w:bidi/>
-              <w:spacing w:after="40"/>
-              <w:jc w:val="right"/>
-            </w:pPr>
-            <w:r>
-              <w:rPr>
-                <w:rFonts w:ascii="Arial" w:cs="Arial" w:eastAsia="Arial" w:hAnsi="Arial"/>
-                <w:b/>
-                <w:bCs/>
-                <w:sz w:val="19"/>
-                <w:szCs w:val="19"/>
-                <w:rtl/>
-              </w:rPr>
-              <w:t xml:space="preserve">בינוני</w:t>
-            </w:r>
-          </w:p>
-        </w:tc>
-        <w:tc>
-          <w:tcPr>
-            <w:tcW w:type="dxa" w:w="3000"/>
-            <w:tcBorders>
-              <w:top w:val="single" w:color="B8BFCC" w:sz="4"/>
-              <w:left w:val="single" w:color="B8BFCC" w:sz="4"/>
-              <w:bottom w:val="single" w:color="B8BFCC" w:sz="4"/>
-              <w:right w:val="single" w:color="B8BFCC" w:sz="4"/>
-            </w:tcBorders>
-            <w:tcMar>
-              <w:top w:type="dxa" w:w="80"/>
-              <w:left w:type="dxa" w:w="100"/>
-              <w:bottom w:type="dxa" w:w="80"/>
-              <w:right w:type="dxa" w:w="100"/>
-            </w:tcMar>
-            <w:vAlign w:val="top"/>
-          </w:tcPr>
-          <w:p>
-            <w:pPr>
-              <w:bidi/>
-              <w:spacing w:after="30"/>
-              <w:jc w:val="right"/>
-            </w:pPr>
-            <w:r>
-              <w:rPr>
-                <w:rFonts w:ascii="Arial" w:cs="Arial" w:eastAsia="Arial" w:hAnsi="Arial"/>
-                <w:sz w:val="19"/>
-                <w:szCs w:val="19"/>
-                <w:rtl/>
-              </w:rPr>
-              <w:t xml:space="preserve">להשתתף ב-X מפגשי התוכנית</w:t>
-            </w:r>
-          </w:p>
-          <w:p>
-            <w:pPr>
-              <w:bidi/>
-              <w:spacing w:after="20"/>
-              <w:jc w:val="right"/>
-            </w:pPr>
-            <w:r>
-              <w:rPr>
-                <w:rFonts w:ascii="Arial" w:cs="Arial" w:eastAsia="Arial" w:hAnsi="Arial"/>
-                <w:color w:val="555555"/>
-                <w:sz w:val="19"/>
-                <w:szCs w:val="19"/>
-                <w:rtl/>
-              </w:rPr>
-              <w:t xml:space="preserve">המספר כרגע: 4. אפשר לשנות בטווח 1 עד 10.</w:t>
-            </w:r>
-          </w:p>
-        </w:tc>
-        <w:tc>
-          <w:tcPr>
-            <w:tcW w:type="dxa" w:w="1050"/>
-            <w:tcBorders>
-              <w:top w:val="single" w:color="B8BFCC" w:sz="4"/>
-              <w:left w:val="single" w:color="B8BFCC" w:sz="4"/>
-              <w:bottom w:val="single" w:color="B8BFCC" w:sz="4"/>
-              <w:right w:val="single" w:color="B8BFCC" w:sz="4"/>
-            </w:tcBorders>
-            <w:tcMar>
-              <w:top w:type="dxa" w:w="80"/>
-              <w:left w:type="dxa" w:w="100"/>
-              <w:bottom w:type="dxa" w:w="80"/>
-              <w:right w:type="dxa" w:w="100"/>
-            </w:tcMar>
-            <w:vAlign w:val="top"/>
-          </w:tcPr>
-          <w:p>
-            <w:pPr>
-              <w:bidi/>
-              <w:spacing w:after="40"/>
-              <w:jc w:val="right"/>
-            </w:pPr>
-            <w:r>
-              <w:rPr>
-                <w:rFonts w:ascii="Arial" w:cs="Arial" w:eastAsia="Arial" w:hAnsi="Arial"/>
-                <w:b/>
-                <w:bCs/>
-                <w:color w:val="B42318"/>
-                <w:sz w:val="19"/>
-                <w:szCs w:val="19"/>
-                <w:rtl/>
-              </w:rPr>
-              <w:t xml:space="preserve">חסר – אשמח לקישור</w:t>
-            </w:r>
-          </w:p>
-        </w:tc>
-        <w:tc>
-          <w:tcPr>
-            <w:tcW w:type="dxa" w:w="2998"/>
-            <w:tcBorders>
-              <w:top w:val="single" w:color="B8BFCC" w:sz="4"/>
-              <w:left w:val="single" w:color="B8BFCC" w:sz="4"/>
-              <w:bottom w:val="single" w:color="B8BFCC" w:sz="4"/>
-              <w:right w:val="single" w:color="B8BFCC" w:sz="4"/>
-            </w:tcBorders>
-            <w:tcMar>
-              <w:top w:type="dxa" w:w="80"/>
-              <w:left w:type="dxa" w:w="100"/>
-              <w:bottom w:type="dxa" w:w="80"/>
-              <w:right w:type="dxa" w:w="100"/>
-            </w:tcMar>
-            <w:vAlign w:val="top"/>
-          </w:tcPr>
-          <w:p>
-            <w:pPr>
-              <w:bidi/>
-              <w:spacing w:after="40"/>
-              <w:jc w:val="right"/>
-            </w:pPr>
-            <w:r>
-              <w:rPr>
-                <w:rFonts w:ascii="Arial" w:cs="Arial" w:eastAsia="Arial" w:hAnsi="Arial"/>
-                <w:sz w:val="19"/>
-                <w:szCs w:val="19"/>
-                <w:rtl/>
-              </w:rPr>
-              <w:t xml:space="preserve"/>
-            </w:r>
-          </w:p>
-        </w:tc>
-      </w:tr>
-      <w:tr>
-        <w:trPr>
-          <w:cantSplit/>
-        </w:trPr>
-        <w:tc>
-          <w:tcPr>
-            <w:tcW w:type="dxa" w:w="450"/>
-            <w:tcBorders>
-              <w:top w:val="single" w:color="B8BFCC" w:sz="4"/>
-              <w:left w:val="single" w:color="B8BFCC" w:sz="4"/>
-              <w:bottom w:val="single" w:color="B8BFCC" w:sz="4"/>
-              <w:right w:val="single" w:color="B8BFCC" w:sz="4"/>
-            </w:tcBorders>
-            <w:tcMar>
-              <w:top w:type="dxa" w:w="80"/>
-              <w:left w:type="dxa" w:w="100"/>
-              <w:bottom w:type="dxa" w:w="80"/>
-              <w:right w:type="dxa" w:w="100"/>
-            </w:tcMar>
-            <w:vAlign w:val="top"/>
-          </w:tcPr>
-          <w:p>
-            <w:pPr>
-              <w:bidi/>
-              <w:spacing w:after="40"/>
-              <w:jc w:val="right"/>
-            </w:pPr>
-            <w:r>
-              <w:rPr>
-                <w:rFonts w:ascii="Arial" w:cs="Arial" w:eastAsia="Arial" w:hAnsi="Arial"/>
-                <w:sz w:val="19"/>
-                <w:szCs w:val="19"/>
-                <w:rtl/>
-              </w:rPr>
-              <w:t xml:space="preserve">19</w:t>
-            </w:r>
-          </w:p>
-        </w:tc>
-        <w:tc>
-          <w:tcPr>
-            <w:tcW w:type="dxa" w:w="2150"/>
-            <w:tcBorders>
-              <w:top w:val="single" w:color="B8BFCC" w:sz="4"/>
-              <w:left w:val="single" w:color="B8BFCC" w:sz="4"/>
-              <w:bottom w:val="single" w:color="B8BFCC" w:sz="4"/>
-              <w:right w:val="single" w:color="B8BFCC" w:sz="4"/>
-            </w:tcBorders>
-            <w:tcMar>
-              <w:top w:type="dxa" w:w="80"/>
-              <w:left w:type="dxa" w:w="100"/>
-              <w:bottom w:type="dxa" w:w="80"/>
-              <w:right w:type="dxa" w:w="100"/>
-            </w:tcMar>
-            <w:vAlign w:val="top"/>
-          </w:tcPr>
-          <w:p>
-            <w:pPr>
-              <w:bidi/>
-              <w:spacing w:after="40"/>
-              <w:jc w:val="right"/>
-            </w:pPr>
-            <w:r>
-              <w:rPr>
-                <w:rFonts w:ascii="Arial" w:cs="Arial" w:eastAsia="Arial" w:hAnsi="Arial"/>
-                <w:b/>
-                <w:bCs/>
-                <w:sz w:val="19"/>
-                <w:szCs w:val="19"/>
-                <w:rtl/>
-              </w:rPr>
-              <w:t xml:space="preserve">קורסי מיומנויות</w:t>
-            </w:r>
-          </w:p>
-        </w:tc>
-        <w:tc>
-          <w:tcPr>
-            <w:tcW w:type="dxa" w:w="2950"/>
-            <w:tcBorders>
-              <w:top w:val="single" w:color="B8BFCC" w:sz="4"/>
-              <w:left w:val="single" w:color="B8BFCC" w:sz="4"/>
-              <w:bottom w:val="single" w:color="B8BFCC" w:sz="4"/>
-              <w:right w:val="single" w:color="B8BFCC" w:sz="4"/>
-            </w:tcBorders>
-            <w:tcMar>
-              <w:top w:type="dxa" w:w="80"/>
-              <w:left w:type="dxa" w:w="100"/>
-              <w:bottom w:type="dxa" w:w="80"/>
-              <w:right w:type="dxa" w:w="100"/>
-            </w:tcMar>
-            <w:vAlign w:val="top"/>
-          </w:tcPr>
-          <w:p>
-            <w:pPr>
-              <w:bidi/>
-              <w:spacing w:after="40"/>
-              <w:jc w:val="right"/>
-            </w:pPr>
-            <w:r>
-              <w:rPr>
-                <w:rFonts w:ascii="Arial" w:cs="Arial" w:eastAsia="Arial" w:hAnsi="Arial"/>
-                <w:sz w:val="19"/>
-                <w:szCs w:val="19"/>
-                <w:rtl/>
-              </w:rPr>
-              <w:t xml:space="preserve">מו"מ, פיתוח מיומנויות ניהול ועוד, עם תרגילים וסימולציות</w:t>
-            </w:r>
-          </w:p>
           <w:p>
             <w:pPr>
               <w:bidi/>
@@ -6489,7 +6225,7 @@
                 <w:szCs w:val="19"/>
                 <w:rtl/>
               </w:rPr>
-              <w:t xml:space="preserve">מופיעה גבוה יותר עבור: מי שרוצה להתקדם בתחום</w:t>
+              <w:t xml:space="preserve">מופיעה גבוה יותר עבור: מי שרוצה להתקדם לניהול</w:t>
             </w:r>
           </w:p>
         </w:tc>
@@ -6594,7 +6330,7 @@
                 <w:szCs w:val="19"/>
                 <w:rtl/>
               </w:rPr>
-              <w:t xml:space="preserve">לקחת X קורסי מיומנויות במהלך התואר</w:t>
+              <w:t xml:space="preserve">להשתתף ב-X מפגשי התוכנית</w:t>
             </w:r>
           </w:p>
           <w:p>
@@ -6611,7 +6347,7 @@
                 <w:szCs w:val="19"/>
                 <w:rtl/>
               </w:rPr>
-              <w:t xml:space="preserve">המספר כרגע: 2. אפשר לשנות בטווח 1 עד 4.</w:t>
+              <w:t xml:space="preserve">המספר כרגע: 4. אפשר לשנות בטווח 1 עד 10.</w:t>
             </w:r>
           </w:p>
         </w:tc>
@@ -6638,342 +6374,7 @@
               <w:spacing w:after="40"/>
               <w:jc w:val="right"/>
             </w:pPr>
-            <w:r>
-              <w:rPr>
-                <w:rFonts w:ascii="Arial" w:cs="Arial" w:eastAsia="Arial" w:hAnsi="Arial"/>
-                <w:color w:val="777777"/>
-                <w:sz w:val="19"/>
-                <w:szCs w:val="19"/>
-                <w:rtl/>
-              </w:rPr>
-              <w:t xml:space="preserve">—</w:t>
-            </w:r>
-          </w:p>
-        </w:tc>
-        <w:tc>
-          <w:tcPr>
-            <w:tcW w:type="dxa" w:w="2998"/>
-            <w:tcBorders>
-              <w:top w:val="single" w:color="B8BFCC" w:sz="4"/>
-              <w:left w:val="single" w:color="B8BFCC" w:sz="4"/>
-              <w:bottom w:val="single" w:color="B8BFCC" w:sz="4"/>
-              <w:right w:val="single" w:color="B8BFCC" w:sz="4"/>
-            </w:tcBorders>
-            <w:tcMar>
-              <w:top w:type="dxa" w:w="80"/>
-              <w:left w:type="dxa" w:w="100"/>
-              <w:bottom w:type="dxa" w:w="80"/>
-              <w:right w:type="dxa" w:w="100"/>
-            </w:tcMar>
-            <w:vAlign w:val="top"/>
-          </w:tcPr>
-          <w:p>
-            <w:pPr>
-              <w:bidi/>
-              <w:spacing w:after="40"/>
-              <w:jc w:val="right"/>
-            </w:pPr>
-            <w:r>
-              <w:rPr>
-                <w:rFonts w:ascii="Arial" w:cs="Arial" w:eastAsia="Arial" w:hAnsi="Arial"/>
-                <w:sz w:val="19"/>
-                <w:szCs w:val="19"/>
-                <w:rtl/>
-              </w:rPr>
-              <w:t xml:space="preserve"/>
-            </w:r>
-          </w:p>
-        </w:tc>
-      </w:tr>
-      <w:tr>
-        <w:trPr>
-          <w:cantSplit/>
-        </w:trPr>
-        <w:tc>
-          <w:tcPr>
-            <w:tcW w:type="dxa" w:w="450"/>
-            <w:tcBorders>
-              <w:top w:val="single" w:color="B8BFCC" w:sz="4"/>
-              <w:left w:val="single" w:color="B8BFCC" w:sz="4"/>
-              <w:bottom w:val="single" w:color="B8BFCC" w:sz="4"/>
-              <w:right w:val="single" w:color="B8BFCC" w:sz="4"/>
-            </w:tcBorders>
-            <w:tcMar>
-              <w:top w:type="dxa" w:w="80"/>
-              <w:left w:type="dxa" w:w="100"/>
-              <w:bottom w:type="dxa" w:w="80"/>
-              <w:right w:type="dxa" w:w="100"/>
-            </w:tcMar>
-            <w:vAlign w:val="top"/>
-          </w:tcPr>
-          <w:p>
-            <w:pPr>
-              <w:bidi/>
-              <w:spacing w:after="40"/>
-              <w:jc w:val="right"/>
-            </w:pPr>
-            <w:r>
-              <w:rPr>
-                <w:rFonts w:ascii="Arial" w:cs="Arial" w:eastAsia="Arial" w:hAnsi="Arial"/>
-                <w:sz w:val="19"/>
-                <w:szCs w:val="19"/>
-                <w:rtl/>
-              </w:rPr>
-              <w:t xml:space="preserve">20</w:t>
-            </w:r>
-          </w:p>
-        </w:tc>
-        <w:tc>
-          <w:tcPr>
-            <w:tcW w:type="dxa" w:w="2150"/>
-            <w:tcBorders>
-              <w:top w:val="single" w:color="B8BFCC" w:sz="4"/>
-              <w:left w:val="single" w:color="B8BFCC" w:sz="4"/>
-              <w:bottom w:val="single" w:color="B8BFCC" w:sz="4"/>
-              <w:right w:val="single" w:color="B8BFCC" w:sz="4"/>
-            </w:tcBorders>
-            <w:tcMar>
-              <w:top w:type="dxa" w:w="80"/>
-              <w:left w:type="dxa" w:w="100"/>
-              <w:bottom w:type="dxa" w:w="80"/>
-              <w:right w:type="dxa" w:w="100"/>
-            </w:tcMar>
-            <w:vAlign w:val="top"/>
-          </w:tcPr>
-          <w:p>
-            <w:pPr>
-              <w:bidi/>
-              <w:spacing w:after="40"/>
-              <w:jc w:val="right"/>
-            </w:pPr>
-            <w:r>
-              <w:rPr>
-                <w:rFonts w:ascii="Arial" w:cs="Arial" w:eastAsia="Arial" w:hAnsi="Arial"/>
-                <w:b/>
-                <w:bCs/>
-                <w:sz w:val="19"/>
-                <w:szCs w:val="19"/>
-                <w:rtl/>
-              </w:rPr>
-              <w:t xml:space="preserve">StartUp Coller ותחרויות יזמות</w:t>
-            </w:r>
-          </w:p>
-        </w:tc>
-        <w:tc>
-          <w:tcPr>
-            <w:tcW w:type="dxa" w:w="2950"/>
-            <w:tcBorders>
-              <w:top w:val="single" w:color="B8BFCC" w:sz="4"/>
-              <w:left w:val="single" w:color="B8BFCC" w:sz="4"/>
-              <w:bottom w:val="single" w:color="B8BFCC" w:sz="4"/>
-              <w:right w:val="single" w:color="B8BFCC" w:sz="4"/>
-            </w:tcBorders>
-            <w:tcMar>
-              <w:top w:type="dxa" w:w="80"/>
-              <w:left w:type="dxa" w:w="100"/>
-              <w:bottom w:type="dxa" w:w="80"/>
-              <w:right w:type="dxa" w:w="100"/>
-            </w:tcMar>
-            <w:vAlign w:val="top"/>
-          </w:tcPr>
-          <w:p>
-            <w:pPr>
-              <w:bidi/>
-              <w:spacing w:after="40"/>
-              <w:jc w:val="right"/>
-            </w:pPr>
-            <w:r>
-              <w:rPr>
-                <w:rFonts w:ascii="Arial" w:cs="Arial" w:eastAsia="Arial" w:hAnsi="Arial"/>
-                <w:sz w:val="19"/>
-                <w:szCs w:val="19"/>
-                <w:rtl/>
-              </w:rPr>
-              <w:t xml:space="preserve">לפתח רעיון בצוות, לקבל ליווי ולהציג מול שופטים</w:t>
-            </w:r>
-          </w:p>
-          <w:p>
-            <w:pPr>
-              <w:bidi/>
-              <w:spacing w:after="40"/>
-              <w:jc w:val="right"/>
-            </w:pPr>
-            <w:r>
-              <w:rPr>
-                <w:rFonts w:ascii="Arial" w:cs="Arial" w:eastAsia="Arial" w:hAnsi="Arial"/>
-                <w:i/>
-                <w:iCs/>
-                <w:color w:val="555555"/>
-                <w:sz w:val="19"/>
-                <w:szCs w:val="19"/>
-                <w:rtl/>
-              </w:rPr>
-              <w:t xml:space="preserve">מופיעה גבוה יותר עבור: מי שרוצה להקים מיזם</w:t>
-            </w:r>
-          </w:p>
-        </w:tc>
-        <w:tc>
-          <w:tcPr>
-            <w:tcW w:type="dxa" w:w="1650"/>
-            <w:tcBorders>
-              <w:top w:val="single" w:color="B8BFCC" w:sz="4"/>
-              <w:left w:val="single" w:color="B8BFCC" w:sz="4"/>
-              <w:bottom w:val="single" w:color="B8BFCC" w:sz="4"/>
-              <w:right w:val="single" w:color="B8BFCC" w:sz="4"/>
-            </w:tcBorders>
-            <w:tcMar>
-              <w:top w:type="dxa" w:w="80"/>
-              <w:left w:type="dxa" w:w="100"/>
-              <w:bottom w:type="dxa" w:w="80"/>
-              <w:right w:type="dxa" w:w="100"/>
-            </w:tcMar>
-            <w:vAlign w:val="top"/>
-          </w:tcPr>
-          <w:p>
-            <w:pPr>
-              <w:bidi/>
-              <w:spacing w:after="20"/>
-              <w:jc w:val="right"/>
-            </w:pPr>
-            <w:r>
-              <w:rPr>
-                <w:rFonts w:ascii="Arial" w:cs="Arial" w:eastAsia="Arial" w:hAnsi="Arial"/>
-                <w:sz w:val="19"/>
-                <w:szCs w:val="19"/>
-                <w:rtl/>
-              </w:rPr>
-              <w:t xml:space="preserve">פיתוח מיומנויות</w:t>
-            </w:r>
-          </w:p>
-          <w:p>
-            <w:pPr>
-              <w:bidi/>
-              <w:spacing w:after="20"/>
-              <w:jc w:val="right"/>
-            </w:pPr>
-            <w:r>
-              <w:rPr>
-                <w:rFonts w:ascii="Arial" w:cs="Arial" w:eastAsia="Arial" w:hAnsi="Arial"/>
-                <w:sz w:val="19"/>
-                <w:szCs w:val="19"/>
-                <w:rtl/>
-              </w:rPr>
-              <w:t xml:space="preserve">הכרת התעשייה</w:t>
-            </w:r>
-          </w:p>
-        </w:tc>
-        <w:tc>
-          <w:tcPr>
-            <w:tcW w:type="dxa" w:w="1150"/>
-            <w:tcBorders>
-              <w:top w:val="single" w:color="B8BFCC" w:sz="4"/>
-              <w:left w:val="single" w:color="B8BFCC" w:sz="4"/>
-              <w:bottom w:val="single" w:color="B8BFCC" w:sz="4"/>
-              <w:right w:val="single" w:color="B8BFCC" w:sz="4"/>
-            </w:tcBorders>
-            <w:shd w:fill="FBE4E1" w:color="auto" w:val="clear"/>
-            <w:tcMar>
-              <w:top w:type="dxa" w:w="80"/>
-              <w:left w:type="dxa" w:w="100"/>
-              <w:bottom w:type="dxa" w:w="80"/>
-              <w:right w:type="dxa" w:w="100"/>
-            </w:tcMar>
-            <w:vAlign w:val="top"/>
-          </w:tcPr>
-          <w:p>
-            <w:pPr>
-              <w:bidi/>
-              <w:spacing w:after="40"/>
-              <w:jc w:val="right"/>
-            </w:pPr>
-            <w:r>
-              <w:rPr>
-                <w:rFonts w:ascii="Arial" w:cs="Arial" w:eastAsia="Arial" w:hAnsi="Arial"/>
-                <w:b/>
-                <w:bCs/>
-                <w:sz w:val="19"/>
-                <w:szCs w:val="19"/>
-                <w:rtl/>
-              </w:rPr>
-              <w:t xml:space="preserve">דורש מחויבות</w:t>
-            </w:r>
-          </w:p>
-        </w:tc>
-        <w:tc>
-          <w:tcPr>
-            <w:tcW w:type="dxa" w:w="3000"/>
-            <w:tcBorders>
-              <w:top w:val="single" w:color="B8BFCC" w:sz="4"/>
-              <w:left w:val="single" w:color="B8BFCC" w:sz="4"/>
-              <w:bottom w:val="single" w:color="B8BFCC" w:sz="4"/>
-              <w:right w:val="single" w:color="B8BFCC" w:sz="4"/>
-            </w:tcBorders>
-            <w:tcMar>
-              <w:top w:type="dxa" w:w="80"/>
-              <w:left w:type="dxa" w:w="100"/>
-              <w:bottom w:type="dxa" w:w="80"/>
-              <w:right w:type="dxa" w:w="100"/>
-            </w:tcMar>
-            <w:vAlign w:val="top"/>
-          </w:tcPr>
-          <w:p>
-            <w:pPr>
-              <w:bidi/>
-              <w:spacing w:after="30"/>
-              <w:jc w:val="right"/>
-            </w:pPr>
-            <w:r>
-              <w:rPr>
-                <w:rFonts w:ascii="Arial" w:cs="Arial" w:eastAsia="Arial" w:hAnsi="Arial"/>
-                <w:sz w:val="19"/>
-                <w:szCs w:val="19"/>
-                <w:rtl/>
-              </w:rPr>
-              <w:t xml:space="preserve">להגיש מועמדות ל-X תחרויות יזמות במהלך התואר</w:t>
-            </w:r>
-          </w:p>
-          <w:p>
-            <w:pPr>
-              <w:bidi/>
-              <w:spacing w:after="20"/>
-              <w:jc w:val="right"/>
-            </w:pPr>
-            <w:r>
-              <w:rPr>
-                <w:rFonts w:ascii="Arial" w:cs="Arial" w:eastAsia="Arial" w:hAnsi="Arial"/>
-                <w:color w:val="555555"/>
-                <w:sz w:val="19"/>
-                <w:szCs w:val="19"/>
-                <w:rtl/>
-              </w:rPr>
-              <w:t xml:space="preserve">המספר כרגע: 1. אפשר לשנות בטווח 1 עד 3.</w:t>
-            </w:r>
-          </w:p>
-        </w:tc>
-        <w:tc>
-          <w:tcPr>
-            <w:tcW w:type="dxa" w:w="1050"/>
-            <w:tcBorders>
-              <w:top w:val="single" w:color="B8BFCC" w:sz="4"/>
-              <w:left w:val="single" w:color="B8BFCC" w:sz="4"/>
-              <w:bottom w:val="single" w:color="B8BFCC" w:sz="4"/>
-              <w:right w:val="single" w:color="B8BFCC" w:sz="4"/>
-            </w:tcBorders>
-            <w:tcMar>
-              <w:top w:type="dxa" w:w="80"/>
-              <w:left w:type="dxa" w:w="100"/>
-              <w:bottom w:type="dxa" w:w="80"/>
-              <w:right w:type="dxa" w:w="100"/>
-            </w:tcMar>
-            <w:vAlign w:val="top"/>
-          </w:tcPr>
-          <w:p>
-            <w:pPr>
-              <w:bidi/>
-              <w:spacing w:after="40"/>
-              <w:jc w:val="right"/>
-            </w:pPr>
-            <w:hyperlink w:history="1" r:id="rIdrpasyfm3jvrpnrkecwjyc">
+            <w:hyperlink w:history="1" r:id="rIdejqzi4hvecjzpvbamdxfm">
               <w:r>
                 <w:rPr>
                   <w:rStyle w:val="Hyperlink"/>
@@ -7056,7 +6457,7 @@
                 <w:szCs w:val="19"/>
                 <w:rtl/>
               </w:rPr>
-              <w:t xml:space="preserve">21</w:t>
+              <w:t xml:space="preserve">19</w:t>
             </w:r>
           </w:p>
         </w:tc>
@@ -7092,7 +6493,7 @@
                 <w:szCs w:val="19"/>
                 <w:rtl/>
               </w:rPr>
-              <w:t xml:space="preserve">תחרות דיבייט</w:t>
+              <w:t xml:space="preserve">קורסי מיומנויות</w:t>
             </w:r>
           </w:p>
         </w:tc>
@@ -7126,7 +6527,26 @@
                 <w:szCs w:val="19"/>
                 <w:rtl/>
               </w:rPr>
-              <w:t xml:space="preserve">לתרגל טיעון, חשיבה מהירה והופעה מול קהל</w:t>
+              <w:t xml:space="preserve">מו"מ, פיתוח מיומנויות ניהול ועוד, עם תרגילים וסימולציות</w:t>
+            </w:r>
+          </w:p>
+          <w:p>
+            <w:pPr>
+              <w:bidi/>
+              <w:spacing w:after="40"/>
+              <w:jc w:val="right"/>
+            </w:pPr>
+            <w:r>
+              <w:rPr>
+                <w:rFonts w:ascii="Arial" w:cs="Arial" w:eastAsia="Arial" w:hAnsi="Arial"/>
+                <w:i/>
+                <w:iCs/>
+                <w:color w:val="555555"/>
+                <w:sz w:val="19"/>
+                <w:szCs w:val="19"/>
+                <w:rtl/>
+              </w:rPr>
+              <w:t xml:space="preserve">מופיעה גבוה יותר עבור: מי שרוצה להתקדם לניהול, מי שרוצה להתקדם בתחום</w:t>
             </w:r>
           </w:p>
         </w:tc>
@@ -7231,7 +6651,7 @@
                 <w:szCs w:val="19"/>
                 <w:rtl/>
               </w:rPr>
-              <w:t xml:space="preserve">להשתתף ב-X תחרויות או אימונים</w:t>
+              <w:t xml:space="preserve">לקחת X קורסי מיומנויות במהלך התואר</w:t>
             </w:r>
           </w:p>
           <w:p>
@@ -7248,7 +6668,7 @@
                 <w:szCs w:val="19"/>
                 <w:rtl/>
               </w:rPr>
-              <w:t xml:space="preserve">המספר כרגע: 2. אפשר לשנות בטווח 1 עד 5.</w:t>
+              <w:t xml:space="preserve">המספר כרגע: 2. אפשר לשנות בטווח 1 עד 4.</w:t>
             </w:r>
           </w:p>
         </w:tc>
@@ -7356,7 +6776,7 @@
                 <w:szCs w:val="19"/>
                 <w:rtl/>
               </w:rPr>
-              <w:t xml:space="preserve">22</w:t>
+              <w:t xml:space="preserve">20</w:t>
             </w:r>
           </w:p>
         </w:tc>
@@ -7392,7 +6812,7 @@
                 <w:szCs w:val="19"/>
                 <w:rtl/>
               </w:rPr>
-              <w:t xml:space="preserve">תחרות לוריאל</w:t>
+              <w:t xml:space="preserve">StartUp Coller ותחרויות יזמות</w:t>
             </w:r>
           </w:p>
         </w:tc>
@@ -7426,7 +6846,26 @@
                 <w:szCs w:val="19"/>
                 <w:rtl/>
               </w:rPr>
-              <w:t xml:space="preserve">אתגר עסקי אמיתי מול חברה בינלאומית</w:t>
+              <w:t xml:space="preserve">לפתח רעיון בצוות, לקבל ליווי ולהציג מול שופטים</w:t>
+            </w:r>
+          </w:p>
+          <w:p>
+            <w:pPr>
+              <w:bidi/>
+              <w:spacing w:after="40"/>
+              <w:jc w:val="right"/>
+            </w:pPr>
+            <w:r>
+              <w:rPr>
+                <w:rFonts w:ascii="Arial" w:cs="Arial" w:eastAsia="Arial" w:hAnsi="Arial"/>
+                <w:i/>
+                <w:iCs/>
+                <w:color w:val="555555"/>
+                <w:sz w:val="19"/>
+                <w:szCs w:val="19"/>
+                <w:rtl/>
+              </w:rPr>
+              <w:t xml:space="preserve">מופיעה גבוה יותר עבור: מי שרוצה להקים מיזם</w:t>
             </w:r>
           </w:p>
         </w:tc>
@@ -7547,7 +6986,7 @@
                 <w:szCs w:val="19"/>
                 <w:rtl/>
               </w:rPr>
-              <w:t xml:space="preserve">להגיש מועמדות ל-X תחרויות עסקיות במהלך התואר</w:t>
+              <w:t xml:space="preserve">להגיש מועמדות ל-X תחרויות יזמות במהלך התואר</w:t>
             </w:r>
           </w:p>
           <w:p>
@@ -7591,7 +7030,7 @@
               <w:spacing w:after="40"/>
               <w:jc w:val="right"/>
             </w:pPr>
-            <w:hyperlink w:history="1" r:id="rIdfz7q1zst91mlv5nb8qcnx">
+            <w:hyperlink w:history="1" r:id="rIdrdt4bvqucvzs_zk7vjofm">
               <w:r>
                 <w:rPr>
                   <w:rStyle w:val="Hyperlink"/>
@@ -7674,7 +7113,7 @@
                 <w:szCs w:val="19"/>
                 <w:rtl/>
               </w:rPr>
-              <w:t xml:space="preserve">23</w:t>
+              <w:t xml:space="preserve">21</w:t>
             </w:r>
           </w:p>
         </w:tc>
@@ -7710,7 +7149,7 @@
                 <w:szCs w:val="19"/>
                 <w:rtl/>
               </w:rPr>
-              <w:t xml:space="preserve">וובינרים</w:t>
+              <w:t xml:space="preserve">תחרות דיבייט</w:t>
             </w:r>
           </w:p>
         </w:tc>
@@ -7744,7 +7183,7 @@
                 <w:szCs w:val="19"/>
                 <w:rtl/>
               </w:rPr>
-              <w:t xml:space="preserve">הרצאות מקוונות קצרות על מיומנויות ותעשיות</w:t>
+              <w:t xml:space="preserve">לתרגל טיעון, חשיבה מהירה והופעה מול קהל</w:t>
             </w:r>
           </w:p>
         </w:tc>
@@ -7781,22 +7220,6 @@
               <w:t xml:space="preserve">פיתוח מיומנויות</w:t>
             </w:r>
           </w:p>
-          <w:p>
-            <w:pPr>
-              <w:bidi/>
-              <w:spacing w:after="20"/>
-              <w:jc w:val="right"/>
-            </w:pPr>
-            <w:r>
-              <w:rPr>
-                <w:rFonts w:ascii="Arial" w:cs="Arial" w:eastAsia="Arial" w:hAnsi="Arial"/>
-                <w:sz w:val="19"/>
-                <w:szCs w:val="19"/>
-                <w:rtl/>
-              </w:rPr>
-              <w:t xml:space="preserve">הכרת התעשייה</w:t>
-            </w:r>
-          </w:p>
         </w:tc>
         <w:tc>
           <w:tcPr>
@@ -7807,7 +7230,7 @@
               <w:bottom w:val="single" w:color="B8BFCC" w:sz="4"/>
               <w:right w:val="single" w:color="B8BFCC" w:sz="4"/>
             </w:tcBorders>
-            <w:shd w:fill="E8F3E8" w:color="auto" w:val="clear"/>
+            <w:shd w:fill="FFF4DC" w:color="auto" w:val="clear"/>
             <w:tcMar>
               <w:top w:type="dxa" w:w="80"/>
               <w:left w:type="dxa" w:w="100"/>
@@ -7831,7 +7254,7 @@
                 <w:szCs w:val="19"/>
                 <w:rtl/>
               </w:rPr>
-              <w:t xml:space="preserve">קל</w:t>
+              <w:t xml:space="preserve">בינוני</w:t>
             </w:r>
           </w:p>
         </w:tc>
@@ -7865,7 +7288,7 @@
                 <w:szCs w:val="19"/>
                 <w:rtl/>
               </w:rPr>
-              <w:t xml:space="preserve">לצפות ב-X וובינרים בסמסטר</w:t>
+              <w:t xml:space="preserve">להשתתף ב-X תחרויות או אימונים</w:t>
             </w:r>
           </w:p>
           <w:p>
@@ -7882,7 +7305,7 @@
                 <w:szCs w:val="19"/>
                 <w:rtl/>
               </w:rPr>
-              <w:t xml:space="preserve">המספר כרגע: 3. אפשר לשנות בטווח 1 עד 8.</w:t>
+              <w:t xml:space="preserve">המספר כרגע: 2. אפשר לשנות בטווח 1 עד 5.</w:t>
             </w:r>
           </w:p>
         </w:tc>
@@ -7990,7 +7413,7 @@
                 <w:szCs w:val="19"/>
                 <w:rtl/>
               </w:rPr>
-              <w:t xml:space="preserve">24</w:t>
+              <w:t xml:space="preserve">22</w:t>
             </w:r>
           </w:p>
         </w:tc>
@@ -8026,6 +7449,640 @@
                 <w:szCs w:val="19"/>
                 <w:rtl/>
               </w:rPr>
+              <w:t xml:space="preserve">תחרות לוריאל</w:t>
+            </w:r>
+          </w:p>
+        </w:tc>
+        <w:tc>
+          <w:tcPr>
+            <w:tcW w:type="dxa" w:w="2950"/>
+            <w:tcBorders>
+              <w:top w:val="single" w:color="B8BFCC" w:sz="4"/>
+              <w:left w:val="single" w:color="B8BFCC" w:sz="4"/>
+              <w:bottom w:val="single" w:color="B8BFCC" w:sz="4"/>
+              <w:right w:val="single" w:color="B8BFCC" w:sz="4"/>
+            </w:tcBorders>
+            <w:tcMar>
+              <w:top w:type="dxa" w:w="80"/>
+              <w:left w:type="dxa" w:w="100"/>
+              <w:bottom w:type="dxa" w:w="80"/>
+              <w:right w:type="dxa" w:w="100"/>
+            </w:tcMar>
+            <w:vAlign w:val="top"/>
+          </w:tcPr>
+          <w:p>
+            <w:pPr>
+              <w:bidi/>
+              <w:spacing w:after="40"/>
+              <w:jc w:val="right"/>
+            </w:pPr>
+            <w:r>
+              <w:rPr>
+                <w:rFonts w:ascii="Arial" w:cs="Arial" w:eastAsia="Arial" w:hAnsi="Arial"/>
+                <w:sz w:val="19"/>
+                <w:szCs w:val="19"/>
+                <w:rtl/>
+              </w:rPr>
+              <w:t xml:space="preserve">אתגר עסקי אמיתי מול חברה בינלאומית</w:t>
+            </w:r>
+          </w:p>
+        </w:tc>
+        <w:tc>
+          <w:tcPr>
+            <w:tcW w:type="dxa" w:w="1650"/>
+            <w:tcBorders>
+              <w:top w:val="single" w:color="B8BFCC" w:sz="4"/>
+              <w:left w:val="single" w:color="B8BFCC" w:sz="4"/>
+              <w:bottom w:val="single" w:color="B8BFCC" w:sz="4"/>
+              <w:right w:val="single" w:color="B8BFCC" w:sz="4"/>
+            </w:tcBorders>
+            <w:tcMar>
+              <w:top w:type="dxa" w:w="80"/>
+              <w:left w:type="dxa" w:w="100"/>
+              <w:bottom w:type="dxa" w:w="80"/>
+              <w:right w:type="dxa" w:w="100"/>
+            </w:tcMar>
+            <w:vAlign w:val="top"/>
+          </w:tcPr>
+          <w:p>
+            <w:pPr>
+              <w:bidi/>
+              <w:spacing w:after="20"/>
+              <w:jc w:val="right"/>
+            </w:pPr>
+            <w:r>
+              <w:rPr>
+                <w:rFonts w:ascii="Arial" w:cs="Arial" w:eastAsia="Arial" w:hAnsi="Arial"/>
+                <w:sz w:val="19"/>
+                <w:szCs w:val="19"/>
+                <w:rtl/>
+              </w:rPr>
+              <w:t xml:space="preserve">פיתוח מיומנויות</w:t>
+            </w:r>
+          </w:p>
+          <w:p>
+            <w:pPr>
+              <w:bidi/>
+              <w:spacing w:after="20"/>
+              <w:jc w:val="right"/>
+            </w:pPr>
+            <w:r>
+              <w:rPr>
+                <w:rFonts w:ascii="Arial" w:cs="Arial" w:eastAsia="Arial" w:hAnsi="Arial"/>
+                <w:sz w:val="19"/>
+                <w:szCs w:val="19"/>
+                <w:rtl/>
+              </w:rPr>
+              <w:t xml:space="preserve">הכרת התעשייה</w:t>
+            </w:r>
+          </w:p>
+        </w:tc>
+        <w:tc>
+          <w:tcPr>
+            <w:tcW w:type="dxa" w:w="1150"/>
+            <w:tcBorders>
+              <w:top w:val="single" w:color="B8BFCC" w:sz="4"/>
+              <w:left w:val="single" w:color="B8BFCC" w:sz="4"/>
+              <w:bottom w:val="single" w:color="B8BFCC" w:sz="4"/>
+              <w:right w:val="single" w:color="B8BFCC" w:sz="4"/>
+            </w:tcBorders>
+            <w:shd w:fill="FBE4E1" w:color="auto" w:val="clear"/>
+            <w:tcMar>
+              <w:top w:type="dxa" w:w="80"/>
+              <w:left w:type="dxa" w:w="100"/>
+              <w:bottom w:type="dxa" w:w="80"/>
+              <w:right w:type="dxa" w:w="100"/>
+            </w:tcMar>
+            <w:vAlign w:val="top"/>
+          </w:tcPr>
+          <w:p>
+            <w:pPr>
+              <w:bidi/>
+              <w:spacing w:after="40"/>
+              <w:jc w:val="right"/>
+            </w:pPr>
+            <w:r>
+              <w:rPr>
+                <w:rFonts w:ascii="Arial" w:cs="Arial" w:eastAsia="Arial" w:hAnsi="Arial"/>
+                <w:b/>
+                <w:bCs/>
+                <w:sz w:val="19"/>
+                <w:szCs w:val="19"/>
+                <w:rtl/>
+              </w:rPr>
+              <w:t xml:space="preserve">דורש מחויבות</w:t>
+            </w:r>
+          </w:p>
+        </w:tc>
+        <w:tc>
+          <w:tcPr>
+            <w:tcW w:type="dxa" w:w="3000"/>
+            <w:tcBorders>
+              <w:top w:val="single" w:color="B8BFCC" w:sz="4"/>
+              <w:left w:val="single" w:color="B8BFCC" w:sz="4"/>
+              <w:bottom w:val="single" w:color="B8BFCC" w:sz="4"/>
+              <w:right w:val="single" w:color="B8BFCC" w:sz="4"/>
+            </w:tcBorders>
+            <w:tcMar>
+              <w:top w:type="dxa" w:w="80"/>
+              <w:left w:type="dxa" w:w="100"/>
+              <w:bottom w:type="dxa" w:w="80"/>
+              <w:right w:type="dxa" w:w="100"/>
+            </w:tcMar>
+            <w:vAlign w:val="top"/>
+          </w:tcPr>
+          <w:p>
+            <w:pPr>
+              <w:bidi/>
+              <w:spacing w:after="30"/>
+              <w:jc w:val="right"/>
+            </w:pPr>
+            <w:r>
+              <w:rPr>
+                <w:rFonts w:ascii="Arial" w:cs="Arial" w:eastAsia="Arial" w:hAnsi="Arial"/>
+                <w:sz w:val="19"/>
+                <w:szCs w:val="19"/>
+                <w:rtl/>
+              </w:rPr>
+              <w:t xml:space="preserve">להגיש מועמדות ל-X תחרויות עסקיות במהלך התואר</w:t>
+            </w:r>
+          </w:p>
+          <w:p>
+            <w:pPr>
+              <w:bidi/>
+              <w:spacing w:after="20"/>
+              <w:jc w:val="right"/>
+            </w:pPr>
+            <w:r>
+              <w:rPr>
+                <w:rFonts w:ascii="Arial" w:cs="Arial" w:eastAsia="Arial" w:hAnsi="Arial"/>
+                <w:color w:val="555555"/>
+                <w:sz w:val="19"/>
+                <w:szCs w:val="19"/>
+                <w:rtl/>
+              </w:rPr>
+              <w:t xml:space="preserve">המספר כרגע: 1. אפשר לשנות בטווח 1 עד 3.</w:t>
+            </w:r>
+          </w:p>
+        </w:tc>
+        <w:tc>
+          <w:tcPr>
+            <w:tcW w:type="dxa" w:w="1050"/>
+            <w:tcBorders>
+              <w:top w:val="single" w:color="B8BFCC" w:sz="4"/>
+              <w:left w:val="single" w:color="B8BFCC" w:sz="4"/>
+              <w:bottom w:val="single" w:color="B8BFCC" w:sz="4"/>
+              <w:right w:val="single" w:color="B8BFCC" w:sz="4"/>
+            </w:tcBorders>
+            <w:tcMar>
+              <w:top w:type="dxa" w:w="80"/>
+              <w:left w:type="dxa" w:w="100"/>
+              <w:bottom w:type="dxa" w:w="80"/>
+              <w:right w:type="dxa" w:w="100"/>
+            </w:tcMar>
+            <w:vAlign w:val="top"/>
+          </w:tcPr>
+          <w:p>
+            <w:pPr>
+              <w:bidi/>
+              <w:spacing w:after="40"/>
+              <w:jc w:val="right"/>
+            </w:pPr>
+            <w:hyperlink w:history="1" r:id="rIdz2pbd2focdeca0coly3s_">
+              <w:r>
+                <w:rPr>
+                  <w:rStyle w:val="Hyperlink"/>
+                  <w:rFonts w:ascii="Arial" w:cs="Arial" w:eastAsia="Arial" w:hAnsi="Arial"/>
+                  <w:sz w:val="19"/>
+                  <w:szCs w:val="19"/>
+                  <w:rtl/>
+                </w:rPr>
+                <w:t xml:space="preserve">קישור</w:t>
+              </w:r>
+            </w:hyperlink>
+          </w:p>
+        </w:tc>
+        <w:tc>
+          <w:tcPr>
+            <w:tcW w:type="dxa" w:w="2998"/>
+            <w:tcBorders>
+              <w:top w:val="single" w:color="B8BFCC" w:sz="4"/>
+              <w:left w:val="single" w:color="B8BFCC" w:sz="4"/>
+              <w:bottom w:val="single" w:color="B8BFCC" w:sz="4"/>
+              <w:right w:val="single" w:color="B8BFCC" w:sz="4"/>
+            </w:tcBorders>
+            <w:tcMar>
+              <w:top w:type="dxa" w:w="80"/>
+              <w:left w:type="dxa" w:w="100"/>
+              <w:bottom w:type="dxa" w:w="80"/>
+              <w:right w:type="dxa" w:w="100"/>
+            </w:tcMar>
+            <w:vAlign w:val="top"/>
+          </w:tcPr>
+          <w:p>
+            <w:pPr>
+              <w:bidi/>
+              <w:spacing w:after="40"/>
+              <w:jc w:val="right"/>
+            </w:pPr>
+            <w:r>
+              <w:rPr>
+                <w:rFonts w:ascii="Arial" w:cs="Arial" w:eastAsia="Arial" w:hAnsi="Arial"/>
+                <w:sz w:val="19"/>
+                <w:szCs w:val="19"/>
+                <w:rtl/>
+              </w:rPr>
+              <w:t xml:space="preserve"/>
+            </w:r>
+          </w:p>
+        </w:tc>
+      </w:tr>
+      <w:tr>
+        <w:trPr>
+          <w:cantSplit/>
+        </w:trPr>
+        <w:tc>
+          <w:tcPr>
+            <w:tcW w:type="dxa" w:w="450"/>
+            <w:tcBorders>
+              <w:top w:val="single" w:color="B8BFCC" w:sz="4"/>
+              <w:left w:val="single" w:color="B8BFCC" w:sz="4"/>
+              <w:bottom w:val="single" w:color="B8BFCC" w:sz="4"/>
+              <w:right w:val="single" w:color="B8BFCC" w:sz="4"/>
+            </w:tcBorders>
+            <w:tcMar>
+              <w:top w:type="dxa" w:w="80"/>
+              <w:left w:type="dxa" w:w="100"/>
+              <w:bottom w:type="dxa" w:w="80"/>
+              <w:right w:type="dxa" w:w="100"/>
+            </w:tcMar>
+            <w:vAlign w:val="top"/>
+          </w:tcPr>
+          <w:p>
+            <w:pPr>
+              <w:bidi/>
+              <w:spacing w:after="40"/>
+              <w:jc w:val="right"/>
+            </w:pPr>
+            <w:r>
+              <w:rPr>
+                <w:rFonts w:ascii="Arial" w:cs="Arial" w:eastAsia="Arial" w:hAnsi="Arial"/>
+                <w:sz w:val="19"/>
+                <w:szCs w:val="19"/>
+                <w:rtl/>
+              </w:rPr>
+              <w:t xml:space="preserve">23</w:t>
+            </w:r>
+          </w:p>
+        </w:tc>
+        <w:tc>
+          <w:tcPr>
+            <w:tcW w:type="dxa" w:w="2150"/>
+            <w:tcBorders>
+              <w:top w:val="single" w:color="B8BFCC" w:sz="4"/>
+              <w:left w:val="single" w:color="B8BFCC" w:sz="4"/>
+              <w:bottom w:val="single" w:color="B8BFCC" w:sz="4"/>
+              <w:right w:val="single" w:color="B8BFCC" w:sz="4"/>
+            </w:tcBorders>
+            <w:tcMar>
+              <w:top w:type="dxa" w:w="80"/>
+              <w:left w:type="dxa" w:w="100"/>
+              <w:bottom w:type="dxa" w:w="80"/>
+              <w:right w:type="dxa" w:w="100"/>
+            </w:tcMar>
+            <w:vAlign w:val="top"/>
+          </w:tcPr>
+          <w:p>
+            <w:pPr>
+              <w:bidi/>
+              <w:spacing w:after="40"/>
+              <w:jc w:val="right"/>
+            </w:pPr>
+            <w:r>
+              <w:rPr>
+                <w:rFonts w:ascii="Arial" w:cs="Arial" w:eastAsia="Arial" w:hAnsi="Arial"/>
+                <w:b/>
+                <w:bCs/>
+                <w:sz w:val="19"/>
+                <w:szCs w:val="19"/>
+                <w:rtl/>
+              </w:rPr>
+              <w:t xml:space="preserve">וובינרים</w:t>
+            </w:r>
+          </w:p>
+        </w:tc>
+        <w:tc>
+          <w:tcPr>
+            <w:tcW w:type="dxa" w:w="2950"/>
+            <w:tcBorders>
+              <w:top w:val="single" w:color="B8BFCC" w:sz="4"/>
+              <w:left w:val="single" w:color="B8BFCC" w:sz="4"/>
+              <w:bottom w:val="single" w:color="B8BFCC" w:sz="4"/>
+              <w:right w:val="single" w:color="B8BFCC" w:sz="4"/>
+            </w:tcBorders>
+            <w:tcMar>
+              <w:top w:type="dxa" w:w="80"/>
+              <w:left w:type="dxa" w:w="100"/>
+              <w:bottom w:type="dxa" w:w="80"/>
+              <w:right w:type="dxa" w:w="100"/>
+            </w:tcMar>
+            <w:vAlign w:val="top"/>
+          </w:tcPr>
+          <w:p>
+            <w:pPr>
+              <w:bidi/>
+              <w:spacing w:after="40"/>
+              <w:jc w:val="right"/>
+            </w:pPr>
+            <w:r>
+              <w:rPr>
+                <w:rFonts w:ascii="Arial" w:cs="Arial" w:eastAsia="Arial" w:hAnsi="Arial"/>
+                <w:sz w:val="19"/>
+                <w:szCs w:val="19"/>
+                <w:rtl/>
+              </w:rPr>
+              <w:t xml:space="preserve">הרצאות מקוונות קצרות על מיומנויות ותעשיות</w:t>
+            </w:r>
+          </w:p>
+        </w:tc>
+        <w:tc>
+          <w:tcPr>
+            <w:tcW w:type="dxa" w:w="1650"/>
+            <w:tcBorders>
+              <w:top w:val="single" w:color="B8BFCC" w:sz="4"/>
+              <w:left w:val="single" w:color="B8BFCC" w:sz="4"/>
+              <w:bottom w:val="single" w:color="B8BFCC" w:sz="4"/>
+              <w:right w:val="single" w:color="B8BFCC" w:sz="4"/>
+            </w:tcBorders>
+            <w:tcMar>
+              <w:top w:type="dxa" w:w="80"/>
+              <w:left w:type="dxa" w:w="100"/>
+              <w:bottom w:type="dxa" w:w="80"/>
+              <w:right w:type="dxa" w:w="100"/>
+            </w:tcMar>
+            <w:vAlign w:val="top"/>
+          </w:tcPr>
+          <w:p>
+            <w:pPr>
+              <w:bidi/>
+              <w:spacing w:after="20"/>
+              <w:jc w:val="right"/>
+            </w:pPr>
+            <w:r>
+              <w:rPr>
+                <w:rFonts w:ascii="Arial" w:cs="Arial" w:eastAsia="Arial" w:hAnsi="Arial"/>
+                <w:sz w:val="19"/>
+                <w:szCs w:val="19"/>
+                <w:rtl/>
+              </w:rPr>
+              <w:t xml:space="preserve">פיתוח מיומנויות</w:t>
+            </w:r>
+          </w:p>
+          <w:p>
+            <w:pPr>
+              <w:bidi/>
+              <w:spacing w:after="20"/>
+              <w:jc w:val="right"/>
+            </w:pPr>
+            <w:r>
+              <w:rPr>
+                <w:rFonts w:ascii="Arial" w:cs="Arial" w:eastAsia="Arial" w:hAnsi="Arial"/>
+                <w:sz w:val="19"/>
+                <w:szCs w:val="19"/>
+                <w:rtl/>
+              </w:rPr>
+              <w:t xml:space="preserve">הכרת התעשייה</w:t>
+            </w:r>
+          </w:p>
+        </w:tc>
+        <w:tc>
+          <w:tcPr>
+            <w:tcW w:type="dxa" w:w="1150"/>
+            <w:tcBorders>
+              <w:top w:val="single" w:color="B8BFCC" w:sz="4"/>
+              <w:left w:val="single" w:color="B8BFCC" w:sz="4"/>
+              <w:bottom w:val="single" w:color="B8BFCC" w:sz="4"/>
+              <w:right w:val="single" w:color="B8BFCC" w:sz="4"/>
+            </w:tcBorders>
+            <w:shd w:fill="E8F3E8" w:color="auto" w:val="clear"/>
+            <w:tcMar>
+              <w:top w:type="dxa" w:w="80"/>
+              <w:left w:type="dxa" w:w="100"/>
+              <w:bottom w:type="dxa" w:w="80"/>
+              <w:right w:type="dxa" w:w="100"/>
+            </w:tcMar>
+            <w:vAlign w:val="top"/>
+          </w:tcPr>
+          <w:p>
+            <w:pPr>
+              <w:bidi/>
+              <w:spacing w:after="40"/>
+              <w:jc w:val="right"/>
+            </w:pPr>
+            <w:r>
+              <w:rPr>
+                <w:rFonts w:ascii="Arial" w:cs="Arial" w:eastAsia="Arial" w:hAnsi="Arial"/>
+                <w:b/>
+                <w:bCs/>
+                <w:sz w:val="19"/>
+                <w:szCs w:val="19"/>
+                <w:rtl/>
+              </w:rPr>
+              <w:t xml:space="preserve">קל</w:t>
+            </w:r>
+          </w:p>
+        </w:tc>
+        <w:tc>
+          <w:tcPr>
+            <w:tcW w:type="dxa" w:w="3000"/>
+            <w:tcBorders>
+              <w:top w:val="single" w:color="B8BFCC" w:sz="4"/>
+              <w:left w:val="single" w:color="B8BFCC" w:sz="4"/>
+              <w:bottom w:val="single" w:color="B8BFCC" w:sz="4"/>
+              <w:right w:val="single" w:color="B8BFCC" w:sz="4"/>
+            </w:tcBorders>
+            <w:tcMar>
+              <w:top w:type="dxa" w:w="80"/>
+              <w:left w:type="dxa" w:w="100"/>
+              <w:bottom w:type="dxa" w:w="80"/>
+              <w:right w:type="dxa" w:w="100"/>
+            </w:tcMar>
+            <w:vAlign w:val="top"/>
+          </w:tcPr>
+          <w:p>
+            <w:pPr>
+              <w:bidi/>
+              <w:spacing w:after="30"/>
+              <w:jc w:val="right"/>
+            </w:pPr>
+            <w:r>
+              <w:rPr>
+                <w:rFonts w:ascii="Arial" w:cs="Arial" w:eastAsia="Arial" w:hAnsi="Arial"/>
+                <w:sz w:val="19"/>
+                <w:szCs w:val="19"/>
+                <w:rtl/>
+              </w:rPr>
+              <w:t xml:space="preserve">לצפות ב-X וובינרים בסמסטר</w:t>
+            </w:r>
+          </w:p>
+          <w:p>
+            <w:pPr>
+              <w:bidi/>
+              <w:spacing w:after="20"/>
+              <w:jc w:val="right"/>
+            </w:pPr>
+            <w:r>
+              <w:rPr>
+                <w:rFonts w:ascii="Arial" w:cs="Arial" w:eastAsia="Arial" w:hAnsi="Arial"/>
+                <w:color w:val="555555"/>
+                <w:sz w:val="19"/>
+                <w:szCs w:val="19"/>
+                <w:rtl/>
+              </w:rPr>
+              <w:t xml:space="preserve">המספר כרגע: 3. אפשר לשנות בטווח 1 עד 8.</w:t>
+            </w:r>
+          </w:p>
+        </w:tc>
+        <w:tc>
+          <w:tcPr>
+            <w:tcW w:type="dxa" w:w="1050"/>
+            <w:tcBorders>
+              <w:top w:val="single" w:color="B8BFCC" w:sz="4"/>
+              <w:left w:val="single" w:color="B8BFCC" w:sz="4"/>
+              <w:bottom w:val="single" w:color="B8BFCC" w:sz="4"/>
+              <w:right w:val="single" w:color="B8BFCC" w:sz="4"/>
+            </w:tcBorders>
+            <w:tcMar>
+              <w:top w:type="dxa" w:w="80"/>
+              <w:left w:type="dxa" w:w="100"/>
+              <w:bottom w:type="dxa" w:w="80"/>
+              <w:right w:type="dxa" w:w="100"/>
+            </w:tcMar>
+            <w:vAlign w:val="top"/>
+          </w:tcPr>
+          <w:p>
+            <w:pPr>
+              <w:bidi/>
+              <w:spacing w:after="40"/>
+              <w:jc w:val="right"/>
+            </w:pPr>
+            <w:r>
+              <w:rPr>
+                <w:rFonts w:ascii="Arial" w:cs="Arial" w:eastAsia="Arial" w:hAnsi="Arial"/>
+                <w:color w:val="777777"/>
+                <w:sz w:val="19"/>
+                <w:szCs w:val="19"/>
+                <w:rtl/>
+              </w:rPr>
+              <w:t xml:space="preserve">—</w:t>
+            </w:r>
+          </w:p>
+        </w:tc>
+        <w:tc>
+          <w:tcPr>
+            <w:tcW w:type="dxa" w:w="2998"/>
+            <w:tcBorders>
+              <w:top w:val="single" w:color="B8BFCC" w:sz="4"/>
+              <w:left w:val="single" w:color="B8BFCC" w:sz="4"/>
+              <w:bottom w:val="single" w:color="B8BFCC" w:sz="4"/>
+              <w:right w:val="single" w:color="B8BFCC" w:sz="4"/>
+            </w:tcBorders>
+            <w:tcMar>
+              <w:top w:type="dxa" w:w="80"/>
+              <w:left w:type="dxa" w:w="100"/>
+              <w:bottom w:type="dxa" w:w="80"/>
+              <w:right w:type="dxa" w:w="100"/>
+            </w:tcMar>
+            <w:vAlign w:val="top"/>
+          </w:tcPr>
+          <w:p>
+            <w:pPr>
+              <w:bidi/>
+              <w:spacing w:after="40"/>
+              <w:jc w:val="right"/>
+            </w:pPr>
+            <w:r>
+              <w:rPr>
+                <w:rFonts w:ascii="Arial" w:cs="Arial" w:eastAsia="Arial" w:hAnsi="Arial"/>
+                <w:sz w:val="19"/>
+                <w:szCs w:val="19"/>
+                <w:rtl/>
+              </w:rPr>
+              <w:t xml:space="preserve"/>
+            </w:r>
+          </w:p>
+        </w:tc>
+      </w:tr>
+      <w:tr>
+        <w:trPr>
+          <w:cantSplit/>
+        </w:trPr>
+        <w:tc>
+          <w:tcPr>
+            <w:tcW w:type="dxa" w:w="450"/>
+            <w:tcBorders>
+              <w:top w:val="single" w:color="B8BFCC" w:sz="4"/>
+              <w:left w:val="single" w:color="B8BFCC" w:sz="4"/>
+              <w:bottom w:val="single" w:color="B8BFCC" w:sz="4"/>
+              <w:right w:val="single" w:color="B8BFCC" w:sz="4"/>
+            </w:tcBorders>
+            <w:tcMar>
+              <w:top w:type="dxa" w:w="80"/>
+              <w:left w:type="dxa" w:w="100"/>
+              <w:bottom w:type="dxa" w:w="80"/>
+              <w:right w:type="dxa" w:w="100"/>
+            </w:tcMar>
+            <w:vAlign w:val="top"/>
+          </w:tcPr>
+          <w:p>
+            <w:pPr>
+              <w:bidi/>
+              <w:spacing w:after="40"/>
+              <w:jc w:val="right"/>
+            </w:pPr>
+            <w:r>
+              <w:rPr>
+                <w:rFonts w:ascii="Arial" w:cs="Arial" w:eastAsia="Arial" w:hAnsi="Arial"/>
+                <w:sz w:val="19"/>
+                <w:szCs w:val="19"/>
+                <w:rtl/>
+              </w:rPr>
+              <w:t xml:space="preserve">24</w:t>
+            </w:r>
+          </w:p>
+        </w:tc>
+        <w:tc>
+          <w:tcPr>
+            <w:tcW w:type="dxa" w:w="2150"/>
+            <w:tcBorders>
+              <w:top w:val="single" w:color="B8BFCC" w:sz="4"/>
+              <w:left w:val="single" w:color="B8BFCC" w:sz="4"/>
+              <w:bottom w:val="single" w:color="B8BFCC" w:sz="4"/>
+              <w:right w:val="single" w:color="B8BFCC" w:sz="4"/>
+            </w:tcBorders>
+            <w:tcMar>
+              <w:top w:type="dxa" w:w="80"/>
+              <w:left w:type="dxa" w:w="100"/>
+              <w:bottom w:type="dxa" w:w="80"/>
+              <w:right w:type="dxa" w:w="100"/>
+            </w:tcMar>
+            <w:vAlign w:val="top"/>
+          </w:tcPr>
+          <w:p>
+            <w:pPr>
+              <w:bidi/>
+              <w:spacing w:after="40"/>
+              <w:jc w:val="right"/>
+            </w:pPr>
+            <w:r>
+              <w:rPr>
+                <w:rFonts w:ascii="Arial" w:cs="Arial" w:eastAsia="Arial" w:hAnsi="Arial"/>
+                <w:b/>
+                <w:bCs/>
+                <w:sz w:val="19"/>
+                <w:szCs w:val="19"/>
+                <w:rtl/>
+              </w:rPr>
               <w:t xml:space="preserve">קורס פרויקט</w:t>
             </w:r>
           </w:p>
@@ -8061,6 +8118,25 @@
                 <w:rtl/>
               </w:rPr>
               <w:t xml:space="preserve">לעבוד בצוות על בעיה אמיתית של ארגון</w:t>
+            </w:r>
+          </w:p>
+          <w:p>
+            <w:pPr>
+              <w:bidi/>
+              <w:spacing w:after="40"/>
+              <w:jc w:val="right"/>
+            </w:pPr>
+            <w:r>
+              <w:rPr>
+                <w:rFonts w:ascii="Arial" w:cs="Arial" w:eastAsia="Arial" w:hAnsi="Arial"/>
+                <w:i/>
+                <w:iCs/>
+                <w:color w:val="555555"/>
+                <w:sz w:val="19"/>
+                <w:szCs w:val="19"/>
+                <w:rtl/>
+              </w:rPr>
+              <w:t xml:space="preserve">מופיעה גבוה יותר עבור: מי שרוצה להתקדם לייעוץ</w:t>
             </w:r>
           </w:p>
         </w:tc>

</xml_diff>